<commit_message>
Finished pctcorrect, ffSndItmsToAssoc, missingpartsNw merges.
</commit_message>
<xml_diff>
--- a/project/documents/communications/PCTCorrectDefects.docx
+++ b/project/documents/communications/PCTCorrectDefects.docx
@@ -436,7 +436,6 @@
         <w:rPr>
           <w:rFonts w:ascii="Times New Roman" w:hAnsi="Times New Roman"/>
           <w:color w:val="000000"/>
-          <w:u w:val="single" w:color="000000"/>
         </w:rPr>
         <w:t>X</w:t>
       </w:r>
@@ -463,20 +462,33 @@
     <w:p>
       <w:pPr>
         <w:widowControl/>
-        <w:tabs>
-          <w:tab w:val="left" w:pos="180"/>
-        </w:tabs>
         <w:autoSpaceDE/>
         <w:autoSpaceDN/>
         <w:adjustRightInd/>
         <w:rPr>
           <w:rFonts w:ascii="Times New Roman" w:hAnsi="Times New Roman"/>
-          <w:b/>
-          <w:bCs/>
-          <w:noProof/>
-          <w:sz w:val="20"/>
-        </w:rPr>
-      </w:pPr>
+        </w:rPr>
+      </w:pPr>
+      <w:r>
+        <w:rPr>
+          <w:rFonts w:ascii="Times New Roman" w:hAnsi="Times New Roman"/>
+        </w:rPr>
+        <w:t>&lt;&lt;</w:t>
+      </w:r>
+      <w:proofErr w:type="spellStart"/>
+      <w:r>
+        <w:rPr>
+          <w:rFonts w:ascii="Times New Roman" w:hAnsi="Times New Roman"/>
+        </w:rPr>
+        <w:t>doclines</w:t>
+      </w:r>
+      <w:proofErr w:type="spellEnd"/>
+      <w:r>
+        <w:rPr>
+          <w:rFonts w:ascii="Times New Roman" w:hAnsi="Times New Roman"/>
+        </w:rPr>
+        <w:t>&gt;&gt;</w:t>
+      </w:r>
     </w:p>
     <w:p>
       <w:pPr>
@@ -858,6 +870,69 @@
       <w:pPr>
         <w:widowControl/>
         <w:tabs>
+          <w:tab w:val="left" w:pos="6480"/>
+          <w:tab w:val="left" w:pos="10080"/>
+        </w:tabs>
+        <w:autoSpaceDE/>
+        <w:autoSpaceDN/>
+        <w:adjustRightInd/>
+        <w:rPr>
+          <w:rFonts w:ascii="Times New Roman" w:hAnsi="Times New Roman"/>
+          <w:b/>
+          <w:bCs/>
+          <w:szCs w:val="20"/>
+        </w:rPr>
+      </w:pPr>
+    </w:p>
+    <w:p>
+      <w:pPr>
+        <w:widowControl/>
+        <w:autoSpaceDE/>
+        <w:autoSpaceDN/>
+        <w:adjustRightInd/>
+        <w:rPr>
+          <w:rFonts w:ascii="Times New Roman" w:hAnsi="Times New Roman"/>
+          <w:noProof/>
+          <w:sz w:val="18"/>
+          <w:szCs w:val="18"/>
+          <w:u w:val="single"/>
+        </w:rPr>
+      </w:pPr>
+    </w:p>
+    <w:p>
+      <w:pPr>
+        <w:widowControl/>
+        <w:autoSpaceDE/>
+        <w:autoSpaceDN/>
+        <w:adjustRightInd/>
+        <w:rPr>
+          <w:rFonts w:ascii="Times New Roman" w:hAnsi="Times New Roman"/>
+          <w:noProof/>
+          <w:sz w:val="18"/>
+          <w:szCs w:val="18"/>
+          <w:u w:val="single"/>
+        </w:rPr>
+      </w:pPr>
+    </w:p>
+    <w:p>
+      <w:pPr>
+        <w:widowControl/>
+        <w:autoSpaceDE/>
+        <w:autoSpaceDN/>
+        <w:adjustRightInd/>
+        <w:rPr>
+          <w:rFonts w:ascii="Times New Roman" w:hAnsi="Times New Roman"/>
+          <w:noProof/>
+          <w:sz w:val="18"/>
+          <w:szCs w:val="18"/>
+          <w:u w:val="single"/>
+        </w:rPr>
+      </w:pPr>
+    </w:p>
+    <w:p>
+      <w:pPr>
+        <w:widowControl/>
+        <w:tabs>
           <w:tab w:val="left" w:pos="5040"/>
         </w:tabs>
         <w:autoSpaceDE/>
@@ -882,8 +957,7 @@
           <w:sz w:val="18"/>
           <w:szCs w:val="18"/>
         </w:rPr>
-        <w:tab/>
-        <w:t xml:space="preserve">                    </w:t>
+        <w:t xml:space="preserve"> </w:t>
       </w:r>
     </w:p>
     <w:p>
@@ -1172,13 +1246,86 @@
           <w:rFonts w:ascii="Times New Roman" w:hAnsi="Times New Roman"/>
           <w:noProof/>
         </w:rPr>
-        <w:pict w14:anchorId="58E4C903">
-          <v:rect id="_x0000_s1026" style="position:absolute;margin-left:1in;margin-top:0;width:451.4pt;height:.95pt;z-index:-1;mso-position-horizontal-relative:page" o:allowincell="f" fillcolor="black" strokeweight="0">
-            <v:fill color2="black"/>
-            <w10:wrap anchorx="page"/>
-            <w10:anchorlock/>
-          </v:rect>
-        </w:pict>
+        <mc:AlternateContent>
+          <mc:Choice Requires="wps">
+            <w:drawing>
+              <wp:anchor distT="0" distB="0" distL="114300" distR="114300" simplePos="0" relativeHeight="251657728" behindDoc="1" locked="1" layoutInCell="0" allowOverlap="1" wp14:anchorId="58BC1BAE" wp14:editId="437EB635">
+                <wp:simplePos x="0" y="0"/>
+                <wp:positionH relativeFrom="page">
+                  <wp:posOffset>914400</wp:posOffset>
+                </wp:positionH>
+                <wp:positionV relativeFrom="paragraph">
+                  <wp:posOffset>0</wp:posOffset>
+                </wp:positionV>
+                <wp:extent cx="5732780" cy="12065"/>
+                <wp:effectExtent l="0" t="0" r="0" b="0"/>
+                <wp:wrapNone/>
+                <wp:docPr id="468577045" name="Rectangle 2"/>
+                <wp:cNvGraphicFramePr>
+                  <a:graphicFrameLocks xmlns:a="http://schemas.openxmlformats.org/drawingml/2006/main"/>
+                </wp:cNvGraphicFramePr>
+                <a:graphic xmlns:a="http://schemas.openxmlformats.org/drawingml/2006/main">
+                  <a:graphicData uri="http://schemas.microsoft.com/office/word/2010/wordprocessingShape">
+                    <wps:wsp>
+                      <wps:cNvSpPr>
+                        <a:spLocks noChangeArrowheads="1"/>
+                      </wps:cNvSpPr>
+                      <wps:spPr bwMode="auto">
+                        <a:xfrm>
+                          <a:off x="0" y="0"/>
+                          <a:ext cx="5732780" cy="12065"/>
+                        </a:xfrm>
+                        <a:prstGeom prst="rect">
+                          <a:avLst/>
+                        </a:prstGeom>
+                        <a:solidFill>
+                          <a:srgbClr val="000000"/>
+                        </a:solidFill>
+                        <a:ln w="0">
+                          <a:solidFill>
+                            <a:srgbClr val="000000"/>
+                          </a:solidFill>
+                          <a:miter lim="800000"/>
+                          <a:headEnd/>
+                          <a:tailEnd/>
+                        </a:ln>
+                        <a:effectLst/>
+                        <a:extLst>
+                          <a:ext uri="{AF507438-7753-43E0-B8FC-AC1667EBCBE1}">
+                            <a14:hiddenEffects xmlns:a14="http://schemas.microsoft.com/office/drawing/2010/main">
+                              <a:effectLst>
+                                <a:outerShdw dist="35921" dir="2700000" algn="ctr" rotWithShape="0">
+                                  <a:srgbClr val="808080"/>
+                                </a:outerShdw>
+                              </a:effectLst>
+                            </a14:hiddenEffects>
+                          </a:ext>
+                        </a:extLst>
+                      </wps:spPr>
+                      <wps:bodyPr rot="0" vert="horz" wrap="square" lIns="91440" tIns="45720" rIns="91440" bIns="45720" anchor="t" anchorCtr="0" upright="1">
+                        <a:noAutofit/>
+                      </wps:bodyPr>
+                    </wps:wsp>
+                  </a:graphicData>
+                </a:graphic>
+                <wp14:sizeRelH relativeFrom="page">
+                  <wp14:pctWidth>0</wp14:pctWidth>
+                </wp14:sizeRelH>
+                <wp14:sizeRelV relativeFrom="page">
+                  <wp14:pctHeight>0</wp14:pctHeight>
+                </wp14:sizeRelV>
+              </wp:anchor>
+            </w:drawing>
+          </mc:Choice>
+          <mc:Fallback>
+            <w:pict>
+              <v:rect w14:anchorId="7950F9A6" id="Rectangle 2" o:spid="_x0000_s1026" style="position:absolute;margin-left:1in;margin-top:0;width:451.4pt;height:.95pt;z-index:-251658752;visibility:visible;mso-wrap-style:square;mso-width-percent:0;mso-height-percent:0;mso-wrap-distance-left:9pt;mso-wrap-distance-top:0;mso-wrap-distance-right:9pt;mso-wrap-distance-bottom:0;mso-position-horizontal:absolute;mso-position-horizontal-relative:page;mso-position-vertical:absolute;mso-position-vertical-relative:text;mso-width-percent:0;mso-height-percent:0;mso-width-relative:page;mso-height-relative:page;v-text-anchor:top" o:gfxdata="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" o:allowincell="f" fillcolor="black" strokeweight="0">
+                <w10:wrap anchorx="page"/>
+                <w10:anchorlock/>
+              </v:rect>
+            </w:pict>
+          </mc:Fallback>
+        </mc:AlternateContent>
       </w:r>
     </w:p>
     <w:p>
@@ -1438,7 +1585,7 @@
           <w:rFonts w:ascii="Times New Roman" w:hAnsi="Times New Roman"/>
           <w:noProof/>
         </w:rPr>
-        <w:t>nnexA</w:t>
+        <w:t>nnex</w:t>
       </w:r>
       <w:r>
         <w:rPr>
@@ -1453,68 +1600,6 @@
           <w:noProof/>
         </w:rPr>
         <w:t>&gt;&gt;</w:t>
-      </w:r>
-    </w:p>
-    <w:p>
-      <w:pPr>
-        <w:pStyle w:val="BodyTextIndent"/>
-        <w:spacing w:line="360" w:lineRule="auto"/>
-        <w:rPr>
-          <w:rFonts w:ascii="Times New Roman" w:hAnsi="Times New Roman"/>
-          <w:noProof/>
-        </w:rPr>
-      </w:pPr>
-      <w:r>
-        <w:rPr>
-          <w:rFonts w:ascii="Times New Roman" w:hAnsi="Times New Roman"/>
-          <w:noProof/>
-        </w:rPr>
-        <w:t>&lt;&lt;</w:t>
-      </w:r>
-      <w:r>
-        <w:rPr>
-          <w:rFonts w:ascii="Times New Roman" w:hAnsi="Times New Roman"/>
-          <w:noProof/>
-        </w:rPr>
-        <w:t>cA</w:t>
-      </w:r>
-      <w:r>
-        <w:rPr>
-          <w:rFonts w:ascii="Times New Roman" w:hAnsi="Times New Roman"/>
-          <w:noProof/>
-        </w:rPr>
-        <w:t>nnexB</w:t>
-      </w:r>
-      <w:r>
-        <w:rPr>
-          <w:rFonts w:ascii="Times New Roman" w:hAnsi="Times New Roman"/>
-          <w:noProof/>
-        </w:rPr>
-        <w:t>Text</w:t>
-      </w:r>
-      <w:r>
-        <w:rPr>
-          <w:rFonts w:ascii="Times New Roman" w:hAnsi="Times New Roman"/>
-          <w:noProof/>
-        </w:rPr>
-        <w:t>&gt;&gt;</w:t>
-      </w:r>
-    </w:p>
-    <w:p>
-      <w:pPr>
-        <w:pStyle w:val="BodyTextIndent"/>
-        <w:spacing w:line="360" w:lineRule="auto"/>
-        <w:rPr>
-          <w:rFonts w:ascii="Times New Roman" w:hAnsi="Times New Roman"/>
-          <w:noProof/>
-        </w:rPr>
-      </w:pPr>
-      <w:r>
-        <w:rPr>
-          <w:rFonts w:ascii="Times New Roman" w:hAnsi="Times New Roman"/>
-          <w:noProof/>
-        </w:rPr>
-        <w:t>&lt;&lt;cAnnexCText&gt;&gt;</w:t>
       </w:r>
     </w:p>
     <w:p>
@@ -2021,6 +2106,34 @@
         </w:rPr>
         <w:t>&gt;&gt;</w:t>
       </w:r>
+    </w:p>
+    <w:p>
+      <w:pPr>
+        <w:rPr>
+          <w:rFonts w:ascii="Times New Roman" w:hAnsi="Times New Roman"/>
+        </w:rPr>
+      </w:pPr>
+    </w:p>
+    <w:p>
+      <w:pPr>
+        <w:rPr>
+          <w:rFonts w:ascii="Times New Roman" w:hAnsi="Times New Roman"/>
+        </w:rPr>
+      </w:pPr>
+    </w:p>
+    <w:p>
+      <w:pPr>
+        <w:rPr>
+          <w:rFonts w:ascii="Times New Roman" w:hAnsi="Times New Roman"/>
+        </w:rPr>
+      </w:pPr>
+    </w:p>
+    <w:p>
+      <w:pPr>
+        <w:rPr>
+          <w:rFonts w:ascii="Times New Roman" w:hAnsi="Times New Roman"/>
+        </w:rPr>
+      </w:pPr>
     </w:p>
     <w:sectPr>
       <w:pgSz w:w="11908" w:h="16833" w:code="9"/>
@@ -2031,14 +2144,6 @@
     </w:sectPr>
   </w:body>
 </w:document>
-</file>
-
-<file path=word/customizations.xml><?xml version="1.0" encoding="utf-8"?>
-<wne:tcg xmlns:r="http://schemas.openxmlformats.org/officeDocument/2006/relationships" xmlns:wne="http://schemas.microsoft.com/office/word/2006/wordml">
-  <wne:toolbars>
-    <wne:toolbarData r:id="rId1"/>
-  </wne:toolbars>
-</wne:tcg>
 </file>
 
 <file path=word/endnotes.xml><?xml version="1.0" encoding="utf-8"?>
@@ -2551,39 +2656,39 @@
         <a:sysClr val="window" lastClr="FFFFFF"/>
       </a:lt1>
       <a:dk2>
-        <a:srgbClr val="44546A"/>
+        <a:srgbClr val="0E2841"/>
       </a:dk2>
       <a:lt2>
-        <a:srgbClr val="E7E6E6"/>
+        <a:srgbClr val="E8E8E8"/>
       </a:lt2>
       <a:accent1>
-        <a:srgbClr val="4472C4"/>
+        <a:srgbClr val="156082"/>
       </a:accent1>
       <a:accent2>
-        <a:srgbClr val="ED7D31"/>
+        <a:srgbClr val="E97132"/>
       </a:accent2>
       <a:accent3>
-        <a:srgbClr val="A5A5A5"/>
+        <a:srgbClr val="196B24"/>
       </a:accent3>
       <a:accent4>
-        <a:srgbClr val="FFC000"/>
+        <a:srgbClr val="0F9ED5"/>
       </a:accent4>
       <a:accent5>
-        <a:srgbClr val="5B9BD5"/>
+        <a:srgbClr val="A02B93"/>
       </a:accent5>
       <a:accent6>
-        <a:srgbClr val="70AD47"/>
+        <a:srgbClr val="4EA72E"/>
       </a:accent6>
       <a:hlink>
-        <a:srgbClr val="0563C1"/>
+        <a:srgbClr val="467886"/>
       </a:hlink>
       <a:folHlink>
-        <a:srgbClr val="954F72"/>
+        <a:srgbClr val="96607D"/>
       </a:folHlink>
     </a:clrScheme>
     <a:fontScheme name="Office">
       <a:majorFont>
-        <a:latin typeface="Calibri Light" panose="020F0302020204030204"/>
+        <a:latin typeface="Aptos Display" panose="02110004020202020204"/>
         <a:ea typeface=""/>
         <a:cs typeface=""/>
         <a:font script="Jpan" typeface="游ゴシック Light"/>
@@ -2635,7 +2740,7 @@
         <a:font script="Tfng" typeface="Ebrima"/>
       </a:majorFont>
       <a:minorFont>
-        <a:latin typeface="Calibri" panose="020F0502020204030204"/>
+        <a:latin typeface="Aptos" panose="02110004020202020204"/>
         <a:ea typeface=""/>
         <a:cs typeface=""/>
         <a:font script="Jpan" typeface="游明朝"/>
@@ -2746,13 +2851,6 @@
         </a:gradFill>
       </a:fillStyleLst>
       <a:lnStyleLst>
-        <a:ln w="6350" cap="flat" cmpd="sng" algn="ctr">
-          <a:solidFill>
-            <a:schemeClr val="phClr"/>
-          </a:solidFill>
-          <a:prstDash val="solid"/>
-          <a:miter lim="800000"/>
-        </a:ln>
         <a:ln w="12700" cap="flat" cmpd="sng" algn="ctr">
           <a:solidFill>
             <a:schemeClr val="phClr"/>
@@ -2761,6 +2859,13 @@
           <a:miter lim="800000"/>
         </a:ln>
         <a:ln w="19050" cap="flat" cmpd="sng" algn="ctr">
+          <a:solidFill>
+            <a:schemeClr val="phClr"/>
+          </a:solidFill>
+          <a:prstDash val="solid"/>
+          <a:miter lim="800000"/>
+        </a:ln>
+        <a:ln w="25400" cap="flat" cmpd="sng" algn="ctr">
           <a:solidFill>
             <a:schemeClr val="phClr"/>
           </a:solidFill>
@@ -2825,11 +2930,31 @@
       </a:bgFillStyleLst>
     </a:fmtScheme>
   </a:themeElements>
-  <a:objectDefaults/>
+  <a:objectDefaults>
+    <a:lnDef>
+      <a:spPr/>
+      <a:bodyPr/>
+      <a:lstStyle/>
+      <a:style>
+        <a:lnRef idx="2">
+          <a:schemeClr val="accent1"/>
+        </a:lnRef>
+        <a:fillRef idx="0">
+          <a:schemeClr val="accent1"/>
+        </a:fillRef>
+        <a:effectRef idx="1">
+          <a:schemeClr val="accent1"/>
+        </a:effectRef>
+        <a:fontRef idx="minor">
+          <a:schemeClr val="tx1"/>
+        </a:fontRef>
+      </a:style>
+    </a:lnDef>
+  </a:objectDefaults>
   <a:extraClrSchemeLst/>
   <a:extLst>
     <a:ext uri="{05A4C25C-085E-4340-85A3-A5531E510DB2}">
-      <thm15:themeFamily xmlns:thm15="http://schemas.microsoft.com/office/thememl/2012/main" name="Office Theme" id="{62F939B6-93AF-4DB8-9C6B-D6C7DFDC589F}" vid="{4A3C46E8-61CC-4603-A589-7422A47A8E4A}"/>
+      <thm15:themeFamily xmlns:thm15="http://schemas.microsoft.com/office/thememl/2012/main" name="Office Theme" id="{2E142A2C-CD16-42D6-873A-C26D2A0506FA}" vid="{1BDDFF52-6CD6-40A5-AB3C-68EB2F1E4D0A}"/>
     </a:ext>
   </a:extLst>
 </a:theme>

</xml_diff>